<commit_message>
Add high-impact Stroke 2025 reference on rehabilitation dose
Lin et al. (Stroke 2025) argues why high-dose, high-intensity stroke
rehabilitation is not delivered in practice despite supporting evidence.
Highest-impact source in the set; backs the poster's case for dedicated
occupational therapy staffing in acute stroke units.

Flagged in the document that it covers rehabilitation dose broadly rather
than occupational therapy exclusively, so it is cited for the dose and
staffing argument only.

Co-Authored-By: Claude Opus 5 <noreply@anthropic.com>
Claude-Session: https://claude.ai/code/session_012XedvnEak9R3Mdy4m6qEaL
</commit_message>
<xml_diff>
--- a/Sustento_Bibliografico_Poster_ACV.docx
+++ b/Sustento_Bibliografico_Poster_ACV.docx
@@ -368,7 +368,7 @@
                 <w:sz w:val="18"/>
                 <w:szCs w:val="18"/>
               </w:rPr>
-              <w:t xml:space="preserve">Ref. 2 (Sci Rep 2025, n=39.140) — PIEZA CLAVE; Ref. 3 (JAMDA, target trial emulation)</w:t>
+              <w:t xml:space="preserve">Ref. 2 (Sci Rep 2025, n=39.140) — PIEZA CLAVE; Ref. 10 (Stroke 2025) — ALTO IMPACTO; Ref. 3 (JAMDA)</w:t>
             </w:r>
           </w:p>
         </w:tc>
@@ -448,7 +448,7 @@
                 <w:sz w:val="18"/>
                 <w:szCs w:val="18"/>
               </w:rPr>
-              <w:t xml:space="preserve">Ref. 4 (Br J Occup Ther 2024, 14 ECA); Ref. 5 (AJOT 2023); Ref. 6 (EOTIPS, PLoS One 2024)</w:t>
+              <w:t xml:space="preserve">Ref. 4 (Br J Occup Ther 2024, 14 ECA); Ref. 5 (AJOT 2023); Ref. 6 (EOTIPS, PLoS One 2024); Ref. 10 (Stroke 2025)</w:t>
             </w:r>
           </w:p>
         </w:tc>
@@ -1854,7 +1854,7 @@
           <w:sz w:val="22"/>
           <w:szCs w:val="22"/>
         </w:rPr>
-        <w:t xml:space="preserve">3.2. Convergencia entre los dos ejes centrales</w:t>
+        <w:t xml:space="preserve">3.2. Respaldo desde una revista de alto impacto</w:t>
       </w:r>
     </w:p>
     <w:p>
@@ -1871,7 +1871,7 @@
           <w:sz w:val="22"/>
           <w:szCs w:val="22"/>
         </w:rPr>
-        <w:t xml:space="preserve">Las Ref. 2 y Ref. 7 coinciden, en cohortes de 39.140 y 3.000 pacientes, en que la función basal en AVD es el principal factor pronóstico del desenlace funcional. Su r = −0,446 va en la misma dirección y en una cohorte latinoamericana en fase aguda, contexto poco representado en esa literatura.</w:t>
+        <w:t xml:space="preserve">La Ref. 10 (Stroke, 2025) es la referencia de mayor factor de impacto del conjunto y argumenta explícitamente por qué la rehabilitación de alta dosis e intensidad no se está entregando en la práctica clínica, pese a la evidencia que la respalda. Es el respaldo más fuerte para la conclusión del póster sobre dotación dedicada de terapia ocupacional en unidades de ACV agudo: su estudio documenta lo que esa revisión reclama. Advertencia de uso: trata la dosis de rehabilitación en general, no la terapia ocupacional de forma exclusiva; cítela para el argumento de dosis y dotación, no como evidencia específica de TO.</w:t>
       </w:r>
     </w:p>
     <w:p>
@@ -1888,7 +1888,7 @@
           <w:sz w:val="22"/>
           <w:szCs w:val="22"/>
         </w:rPr>
-        <w:t xml:space="preserve">3.3. Precisiones de redacción aplicadas</w:t>
+        <w:t xml:space="preserve">3.3. Convergencia entre los dos ejes centrales</w:t>
       </w:r>
     </w:p>
     <w:p>
@@ -1905,7 +1905,24 @@
           <w:sz w:val="22"/>
           <w:szCs w:val="22"/>
         </w:rPr>
-        <w:t xml:space="preserve">• Deterioro: «ningún paciente descendió de categoría funcional (0/78); 98,7% sin deterioro de puntaje». Un paciente de 93 años descendió 5 puntos de Barthel sin cambiar de categoría.</w:t>
+        <w:t xml:space="preserve">Las Ref. 2 y Ref. 7 coinciden, en cohortes de 39.140 y 3.000 pacientes, en que la función basal en AVD es el principal factor pronóstico del desenlace funcional. Su r = −0,446 va en la misma dirección y en una cohorte latinoamericana en fase aguda, contexto poco representado en esa literatura.</w:t>
+      </w:r>
+    </w:p>
+    <w:p>
+      <w:pPr>
+        <w:spacing w:after="100"/>
+      </w:pPr>
+      <w:r>
+        <w:rPr>
+          <w:b/>
+          <w:bCs/>
+          <w:i w:val="false"/>
+          <w:iCs w:val="false"/>
+          <w:color w:val="0B0B0B"/>
+          <w:sz w:val="22"/>
+          <w:szCs w:val="22"/>
+        </w:rPr>
+        <w:t xml:space="preserve">3.4. Precisiones de redacción aplicadas</w:t>
       </w:r>
     </w:p>
     <w:p>
@@ -1922,7 +1939,7 @@
           <w:sz w:val="22"/>
           <w:szCs w:val="22"/>
         </w:rPr>
-        <w:t xml:space="preserve">• Grupo etario: rotular 76–90 años, que es el corte que reproduce exactamente las cifras publicadas (+2,7 pts; 81,0%).</w:t>
+        <w:t xml:space="preserve">• Deterioro: «ningún paciente descendió de categoría funcional (0/78); 98,7% sin deterioro de puntaje». Un paciente de 93 años descendió 5 puntos de Barthel sin cambiar de categoría.</w:t>
       </w:r>
     </w:p>
     <w:p>
@@ -1939,6 +1956,23 @@
           <w:sz w:val="22"/>
           <w:szCs w:val="22"/>
         </w:rPr>
+        <w:t xml:space="preserve">• Grupo etario: rotular 76–90 años, que es el corte que reproduce exactamente las cifras publicadas (+2,7 pts; 81,0%).</w:t>
+      </w:r>
+    </w:p>
+    <w:p>
+      <w:pPr>
+        <w:spacing w:after="120"/>
+      </w:pPr>
+      <w:r>
+        <w:rPr>
+          <w:b w:val="false"/>
+          <w:bCs w:val="false"/>
+          <w:i w:val="false"/>
+          <w:iCs w:val="false"/>
+          <w:color w:val="0B0B0B"/>
+          <w:sz w:val="22"/>
+          <w:szCs w:val="22"/>
+        </w:rPr>
         <w:t xml:space="preserve">• Severidad: definir explícitamente «Severe = BI 20–35» (21/25 = 84,0%). Sin esa definición la cifra no es reproducible: todo BI ≤35 rinde 63,2%.</w:t>
       </w:r>
     </w:p>
@@ -1956,7 +1990,7 @@
           <w:sz w:val="22"/>
           <w:szCs w:val="22"/>
         </w:rPr>
-        <w:t xml:space="preserve">3.4. Limitaciones a declarar antes de que las pregunten</w:t>
+        <w:t xml:space="preserve">3.5. Limitaciones a declarar antes de que las pregunten</w:t>
       </w:r>
     </w:p>
     <w:p>
@@ -2119,6 +2153,23 @@
           <w:szCs w:val="19"/>
         </w:rPr>
         <w:t xml:space="preserve">8. Girgenti SG, Brunson AO, Marsh EB. Baseline function and rehabilitation are as important as stroke severity as long-term predictors of cognitive performance post-stroke. Am J Phys Med Rehabil. 2023;102(2S):S43–S50. PMID 36634330. DOI 10.1097/PHM.0000000000002125.</w:t>
+      </w:r>
+    </w:p>
+    <w:p>
+      <w:pPr>
+        <w:spacing w:after="130"/>
+      </w:pPr>
+      <w:r>
+        <w:rPr>
+          <w:b w:val="false"/>
+          <w:bCs w:val="false"/>
+          <w:i w:val="false"/>
+          <w:iCs w:val="false"/>
+          <w:color w:val="0B0B0B"/>
+          <w:sz w:val="19"/>
+          <w:szCs w:val="19"/>
+        </w:rPr>
+        <w:t xml:space="preserve">10. Lin DJ, Cramer SC, Boyne P, Khatri P, Krakauer JW. High-dose, high-intensity stroke rehabilitation: why aren't we giving it? Stroke. 2025;56(5):1351–1364. DOI 10.1161/STROKEAHA.124.043650. PMC12039970.</w:t>
       </w:r>
     </w:p>
     <w:p>

</xml_diff>

<commit_message>
Add NNR 2024 and Stroke 2017 occupational therapy references
- Somerville et al. (Neurorehabil Neural Repair 2024), the field's own
  journal and an occupational therapy research group. Its finding that
  daily activity performance differs between the rehabilitation unit and
  home is added as a declared limitation: the discharge Barthel here is a
  hospital measurement.
- Legg et al. (Stroke 2017), occupational therapy specific in a
  high-impact journal, labelled as a historical anchor since it falls
  outside the 5-6 year window.
- Record that no occupational therapy specific trial exists in Lancet
  Neurology, JAMA Neurology or Stroke for 2020-2026.
- Fix reference ordering, which had 10 before 9, and restore missing
  Spanish accents in the added text.

Co-Authored-By: Claude Opus 5 <noreply@anthropic.com>
Claude-Session: https://claude.ai/code/session_012XedvnEak9R3Mdy4m6qEaL
</commit_message>
<xml_diff>
--- a/Sustento_Bibliografico_Poster_ACV.docx
+++ b/Sustento_Bibliografico_Poster_ACV.docx
@@ -96,6 +96,25 @@
           <w:szCs w:val="19"/>
         </w:rPr>
         <w:t xml:space="preserve">Advertencia a considerar: el corte de 5–6 años excluye la evidencia histórica de referencia del campo (ensayo AVERT, Lancet 2015 y Neurology 2016; revisiones Cochrane de terapia ocupacional 2017 y de movilización precoz 2018). Un jurado de congreso mundial podría esperar verlas citadas. Se sugiere evaluar incluir dos o tres como anclas históricas, además de la base reciente que aquí se entrega.</w:t>
+      </w:r>
+    </w:p>
+    <w:p>
+      <w:pPr>
+        <w:pBdr>
+          <w:left w:val="single" w:color="1C5CAB" w:sz="12" w:space="10"/>
+        </w:pBdr>
+        <w:spacing w:after="180"/>
+        <w:ind w:left="200"/>
+      </w:pPr>
+      <w:r>
+        <w:rPr>
+          <w:i/>
+          <w:iCs/>
+          <w:color w:val="52514E"/>
+          <w:sz w:val="19"/>
+          <w:szCs w:val="19"/>
+        </w:rPr>
+        <w:t xml:space="preserve">Búsqueda en revistas generalistas de primer nivel: no existe, entre 2020 y 2026, un ensayo específico de terapia ocupacional en Lancet Neurology, JAMA Neurology ni Stroke. Las revistas generalistas de mayor impacto prácticamente no publican ensayos OT-específicos; la evidencia OT-específica de mayor calidad está en Cochrane, British Journal of Occupational Therapy y AJOT (Ref. 4, 5 y 6). Por eso se incorpora la Ref. 11, publicada en Neurorehabilitation and Neural Repair, revista de referencia específica del campo y la más pertinente ante el público de un congreso de neurorrehabilitación.</w:t>
       </w:r>
     </w:p>
     <w:p>
@@ -448,7 +467,7 @@
                 <w:sz w:val="18"/>
                 <w:szCs w:val="18"/>
               </w:rPr>
-              <w:t xml:space="preserve">Ref. 4 (Br J Occup Ther 2024, 14 ECA); Ref. 5 (AJOT 2023); Ref. 6 (EOTIPS, PLoS One 2024); Ref. 10 (Stroke 2025)</w:t>
+              <w:t xml:space="preserve">Ref. 11 (Neurorehabil Neural Repair 2024) — REVISTA DEL CAMPO; Ref. 4 (Br J Occup Ther 2024, 14 ECA); Ref. 5 (AJOT 2023); Ref. 6 (EOTIPS 2024); Ref. 12 (Stroke 2017, ancla histórica)</w:t>
             </w:r>
           </w:p>
         </w:tc>
@@ -2007,6 +2026,23 @@
           <w:sz w:val="22"/>
           <w:szCs w:val="22"/>
         </w:rPr>
+        <w:t xml:space="preserve">• El Barthel de egreso es una medición intrahospitalaria. La Ref. 11 (Neurorehabil Neural Repair 2024) documenta que el desempeño en actividades diarias difiere entre la unidad de hospitalización y el domicilio, por lo que la transferencia de estos resultados al desempeño domiciliario no está establecida y debe declararse como limitación.</w:t>
+      </w:r>
+    </w:p>
+    <w:p>
+      <w:pPr>
+        <w:spacing w:after="120"/>
+      </w:pPr>
+      <w:r>
+        <w:rPr>
+          <w:b w:val="false"/>
+          <w:bCs w:val="false"/>
+          <w:i w:val="false"/>
+          <w:iCs w:val="false"/>
+          <w:color w:val="0B0B0B"/>
+          <w:sz w:val="22"/>
+          <w:szCs w:val="22"/>
+        </w:rPr>
         <w:t xml:space="preserve">Diseño retrospectivo sin grupo control (no permite atribuir causalidad a la TO); atrición no aleatoria (26/104 sin Barthel pareado, de mayor edad —76,5 vs 69,8 años— y estadía más larga); &gt;90 años con n=4–5, estimaciones inestables; MMSE en versión de 19 puntos, no estándar; efecto techo en pacientes jóvenes; y regresión a la media como explicación alternativa parcial de la correlación entre puntaje de ingreso y cambio.</w:t>
       </w:r>
     </w:p>
@@ -2050,7 +2086,7 @@
           <w:sz w:val="19"/>
           <w:szCs w:val="19"/>
         </w:rPr>
-        <w:t xml:space="preserve">2. Effectiveness of rehabilitation dose heterogeneity for improving functional outcomes of patients with acute stroke: a nationwide observational study. Sci Rep. 2025. DOI 10.1038/s41598-025-32006-w. [Autores, volumen y páginas por confirmar]</w:t>
+        <w:t xml:space="preserve">2. Effectiveness of rehabilitation dose heterogeneity for improving functional outcomes of patients with acute stroke: a nationwide observational study. Sci Rep. 2025. DOI 10.1038/s41598-025-32006-w. [Autores, volumen y paginas por confirmar]</w:t>
       </w:r>
     </w:p>
     <w:p>
@@ -2067,7 +2103,7 @@
           <w:sz w:val="19"/>
           <w:szCs w:val="19"/>
         </w:rPr>
-        <w:t xml:space="preserve">3. Heterogeneity in the effectiveness of rehabilitation dose on activities of daily living in post-acute stroke: target trial emulation. J Am Med Dir Assoc. PMID 41966702. [Autores, año, volumen y páginas por confirmar]</w:t>
+        <w:t xml:space="preserve">3. Heterogeneity in the effectiveness of rehabilitation dose on activities of daily living in post-acute stroke: target trial emulation. J Am Med Dir Assoc. PMID 41966702. [Autores, ano, volumen y paginas por confirmar]</w:t>
       </w:r>
     </w:p>
     <w:p>
@@ -2084,7 +2120,7 @@
           <w:sz w:val="19"/>
           <w:szCs w:val="19"/>
         </w:rPr>
-        <w:t xml:space="preserve">4. Triantis E, Liu KP. Activities of daily living interventions on activity performance of inpatients post-stroke: a systematic review and meta-analysis. Br J Occup Ther. 2024;87(10):598–613. PMID 40343210.</w:t>
+        <w:t xml:space="preserve">4. Triantis E, Liu KP. Activities of daily living interventions on activity performance of inpatients post-stroke: a systematic review and meta-analysis. Br J Occup Ther. 2024;87(10):598-613. PMID 40343210.</w:t>
       </w:r>
     </w:p>
     <w:p>
@@ -2101,7 +2137,7 @@
           <w:sz w:val="19"/>
           <w:szCs w:val="19"/>
         </w:rPr>
-        <w:t xml:space="preserve">5. Occupational therapy and activities of daily living interventions to improve performance in activities of daily living for adults with stroke (2012–2019). Am J Occup Ther. 2023. PMID 37220005. [Autores, volumen y páginas por confirmar]</w:t>
+        <w:t xml:space="preserve">5. Occupational therapy and activities of daily living interventions to improve performance in activities of daily living for adults with stroke (2012-2019). Am J Occup Ther. 2023. PMID 37220005. [Autores, volumen y paginas por confirmar]</w:t>
       </w:r>
     </w:p>
     <w:p>
@@ -2118,7 +2154,7 @@
           <w:sz w:val="19"/>
           <w:szCs w:val="19"/>
         </w:rPr>
-        <w:t xml:space="preserve">6. Early Occupational Therapy Intervention post-stroke (EOTIPS): a randomized controlled trial. PLoS One. 2024. PMID 39159190. DOI 10.1371/journal.pone.0308800. [Autores, volumen y páginas por confirmar]</w:t>
+        <w:t xml:space="preserve">6. Early Occupational Therapy Intervention post-stroke (EOTIPS): a randomized controlled trial. PLoS One. 2024. PMID 39159190. DOI 10.1371/journal.pone.0308800. [Autores, volumen y paginas por confirmar]</w:t>
       </w:r>
     </w:p>
     <w:p>
@@ -2135,7 +2171,7 @@
           <w:sz w:val="19"/>
           <w:szCs w:val="19"/>
         </w:rPr>
-        <w:t xml:space="preserve">7. Prognostic factors of functional outcome in post-acute stroke in the rehabilitation unit. J Formos Med Assoc. 2021. PMID 34303583. [Autores, volumen y páginas por confirmar]</w:t>
+        <w:t xml:space="preserve">7. Prognostic factors of functional outcome in post-acute stroke in the rehabilitation unit. J Formos Med Assoc. 2021. PMID 34303583. [Autores, volumen y paginas por confirmar]</w:t>
       </w:r>
     </w:p>
     <w:p>
@@ -2152,7 +2188,7 @@
           <w:sz w:val="19"/>
           <w:szCs w:val="19"/>
         </w:rPr>
-        <w:t xml:space="preserve">8. Girgenti SG, Brunson AO, Marsh EB. Baseline function and rehabilitation are as important as stroke severity as long-term predictors of cognitive performance post-stroke. Am J Phys Med Rehabil. 2023;102(2S):S43–S50. PMID 36634330. DOI 10.1097/PHM.0000000000002125.</w:t>
+        <w:t xml:space="preserve">8. Girgenti SG, Brunson AO, Marsh EB. Baseline function and rehabilitation are as important as stroke severity as long-term predictors of cognitive performance post-stroke. Am J Phys Med Rehabil. 2023;102(2S):S43-S50. PMID 36634330. DOI 10.1097/PHM.0000000000002125.</w:t>
       </w:r>
     </w:p>
     <w:p>
@@ -2169,7 +2205,7 @@
           <w:sz w:val="19"/>
           <w:szCs w:val="19"/>
         </w:rPr>
-        <w:t xml:space="preserve">10. Lin DJ, Cramer SC, Boyne P, Khatri P, Krakauer JW. High-dose, high-intensity stroke rehabilitation: why aren't we giving it? Stroke. 2025;56(5):1351–1364. DOI 10.1161/STROKEAHA.124.043650. PMC12039970.</w:t>
+        <w:t xml:space="preserve">9. The impact of cognitive function deficits and their recovery on functional outcome in subjects affected by ischemic subacute stroke: results from the Italian multicenter longitudinal study CogniReMo. Eur J Phys Rehabil Med. 2023;59(3):284-93. PMID 37184413. [Autores por confirmar]</w:t>
       </w:r>
     </w:p>
     <w:p>
@@ -2186,7 +2222,41 @@
           <w:sz w:val="19"/>
           <w:szCs w:val="19"/>
         </w:rPr>
-        <w:t xml:space="preserve">9. The impact of cognitive function deficits and their recovery on functional outcome in subjects affected by ischemic subacute stroke: results from the Italian multicenter longitudinal study CogniReMo. Eur J Phys Rehabil Med. 2023;59(3):284–93. PMID 37184413. [Autores por confirmar]</w:t>
+        <w:t xml:space="preserve">10. Lin DJ, Cramer SC, Boyne P, Khatri P, Krakauer JW. High-dose, high-intensity stroke rehabilitation: why aren’t we giving it? Stroke. 2025;56(5):1351-1364. DOI 10.1161/STROKEAHA.124.043650. PMC12039970.</w:t>
+      </w:r>
+    </w:p>
+    <w:p>
+      <w:pPr>
+        <w:spacing w:after="130"/>
+      </w:pPr>
+      <w:r>
+        <w:rPr>
+          <w:b w:val="false"/>
+          <w:bCs w:val="false"/>
+          <w:i w:val="false"/>
+          <w:iCs w:val="false"/>
+          <w:color w:val="0B0B0B"/>
+          <w:sz w:val="19"/>
+          <w:szCs w:val="19"/>
+        </w:rPr>
+        <w:t xml:space="preserve">11. Somerville E, Blenden G, Kretzer D, Holden B, Bollinger RM, Krauss MJ, Haxton M, Martin N, Carter A, Stark SL. Differences in daily activity performance between inpatient rehabilitation facility and home among stroke survivors. Neurorehabil Neural Repair. 2024;38(6):403-412. PMID 38602200. DOI 10.1177/15459683241246266.</w:t>
+      </w:r>
+    </w:p>
+    <w:p>
+      <w:pPr>
+        <w:spacing w:after="130"/>
+      </w:pPr>
+      <w:r>
+        <w:rPr>
+          <w:b w:val="false"/>
+          <w:bCs w:val="false"/>
+          <w:i w:val="false"/>
+          <w:iCs w:val="false"/>
+          <w:color w:val="0B0B0B"/>
+          <w:sz w:val="19"/>
+          <w:szCs w:val="19"/>
+        </w:rPr>
+        <w:t xml:space="preserve">12. Legg L, Lewis SR, Schofield-Robinson OJ, Drummond A, Langhorne P. Occupational therapy for adults with problems in activities of daily living after stroke. Stroke. 2017;48(11):e321-e322. DOI 10.1161/STROKEAHA.117.018923.  [ANCLA HISTÓRICA: fuera del corte de 5–6 años]</w:t>
       </w:r>
     </w:p>
     <w:sectPr>

</xml_diff>

<commit_message>
Document ceiling-corrected recovery as a new result
New section 3.2 records recovery normalised by available headroom
(gain divided by 100 minus admission Barthel), which answers the
regression-to-the-mean objection the raw correlation invites.

Cohort recovers 50.2% of available headroom. By admission category:
total dependence 24%, severe 69%, moderate 50%, mild 49%. Patients
independent on admission are excluded, their headroom being zero.

The severe group's advantage survives the correction, so it is not an
artefact of having had more room to improve. Also records the clinical
nuance that totally dependent patients recover the smallest share of
their own margin despite a sizeable absolute gain.

Limitations section updated: the regression-to-the-mean caveat now
points to this correction as a partial, not complete, answer.

Co-Authored-By: Claude Opus 5 <noreply@anthropic.com>
Claude-Session: https://claude.ai/code/session_012XedvnEak9R3Mdy4m6qEaL
</commit_message>
<xml_diff>
--- a/Sustento_Bibliografico_Poster_ACV.docx
+++ b/Sustento_Bibliografico_Poster_ACV.docx
@@ -2195,7 +2195,7 @@
           <w:sz w:val="22"/>
           <w:szCs w:val="22"/>
         </w:rPr>
-        <w:t xml:space="preserve">3.2. ¿Existe algún estudio que haya hecho lo mismo?</w:t>
+        <w:t xml:space="preserve">3.2. Resultado nuevo: recuperación corregida por el techo del instrumento</w:t>
       </w:r>
     </w:p>
     <w:p>
@@ -2212,7 +2212,7 @@
           <w:sz w:val="22"/>
           <w:szCs w:val="22"/>
         </w:rPr>
-        <w:t xml:space="preserve">Búsqueda dirigida: no se encontró ningún estudio que replique el diseño completo de este trabajo, es decir, una cohorte de hospitalización aguda por ACV con terapia ocupacional centrada en reentrenamiento de AVD, con Barthel medido de ingreso a egreso dentro de una estadía de mediana 5 días, en población latinoamericana. Los trabajos más cercanos difieren en un punto crítico cada uno.</w:t>
+        <w:t xml:space="preserve">El Barthel tiene un techo de 100 puntos, de modo que la ganancia máxima posible de cada paciente está limitada por su puntaje de ingreso (techo disponible = 100 − BI de ingreso). Esto abre una objeción metodológica previsible: la correlación inversa entre Barthel de ingreso y ganancia (r = −0,446) podría ser en parte un artefacto, porque quien ingresa peor simplemente tiene más espacio para mejorar. Es la objeción de regresión a la media, y es la crítica más probable a este resultado.</w:t>
       </w:r>
     </w:p>
     <w:p>
@@ -2229,7 +2229,7 @@
           <w:sz w:val="22"/>
           <w:szCs w:val="22"/>
         </w:rPr>
-        <w:t xml:space="preserve">La Ref. 12 (Singapur, 2025; n=216) es la más parecida y la coincidencia es notable: usa exactamente el mismo desenlace primario —mejora de al menos un nivel de Barthel modificado entre ingreso y egreso— y una edad media casi idéntica (71,2 frente a 71,5 años). La diferencia está en el entorno: rehabilitación de internación en hospital comunitario, es decir, fase post-aguda, no hospitalización aguda.</w:t>
+        <w:t xml:space="preserve">Para responderla se normalizó la ganancia por el margen realmente disponible en cada paciente: proporción del techo recuperada = ΔBI ÷ (100 − BI de ingreso). Resultados: cohorte completa 50,2%. Por categoría de ingreso: dependencia total (&lt;20) 24%; severa (20–35) 69%; moderada (40–55) 50%; leve (60–99) 49%. Los independientes al ingreso (BI 100, n=4) quedan excluidos porque su margen es cero y el cociente resulta indefinido.</w:t>
       </w:r>
     </w:p>
     <w:p>
@@ -2246,7 +2246,7 @@
           <w:sz w:val="22"/>
           <w:szCs w:val="22"/>
         </w:rPr>
-        <w:t xml:space="preserve">La Ref. 13 (Tailandia, 2025; n=155) comparte el entorno exacto —unidad de ACV agudo, pacientes consecutivos con primer ACV— pero mide la trayectoria funcional desde el egreso hasta los seis meses, no el cambio que ocurre durante la hospitalización, que es justamente lo que este trabajo documenta.</w:t>
+        <w:t xml:space="preserve">Lectura: la ventaja del grupo severo se mantiene, y se acentúa, después de corregir por el techo. Recupera el 69% de todo lo que tenía por recuperar, frente a alrededor del 50% en el resto de las categorías. No es, por tanto, un artefacto de haber dispuesto de más espacio. Este resultado sostiene de forma directa la recomendación de concentrar la dosis de terapia ocupacional en la categoría severa, y conviene incluirlo en el póster porque desarma por anticipado la objeción metodológica más probable.</w:t>
       </w:r>
     </w:p>
     <w:p>
@@ -2263,7 +2263,24 @@
           <w:sz w:val="22"/>
           <w:szCs w:val="22"/>
         </w:rPr>
-        <w:t xml:space="preserve">Conclusión aprovechable para la defensa del póster: la ventana que este estudio mide —el cambio funcional que ocurre dentro de la hospitalización aguda misma, con Barthel pareado de ingreso y egreso— está poco documentada en la literatura reciente, y no se encontró en cohorte latinoamericana. Esa es la contribución específica del trabajo y conviene enunciarla de forma explícita, en lugar de presentarlo solo como una confirmación de hallazgos previos.</w:t>
+        <w:t xml:space="preserve">Matiz clínico que también conviene declarar: los pacientes con dependencia total al ingreso (BI &lt;20) recuperan solo el 24% de su margen disponible, la proporción más baja de la cohorte, pese a ganar +24 puntos brutos. Son quienes menos aprovechan la ventana de hospitalización aguda, lo que sugiere que podrían requerir un abordaje cualitativamente distinto y no únicamente mayor frecuencia.</w:t>
+      </w:r>
+    </w:p>
+    <w:p>
+      <w:pPr>
+        <w:spacing w:after="160"/>
+      </w:pPr>
+      <w:r>
+        <w:rPr>
+          <w:b w:val="false"/>
+          <w:bCs w:val="false"/>
+          <w:i w:val="false"/>
+          <w:iCs w:val="false"/>
+          <w:color w:val="52514E"/>
+          <w:sz w:val="20"/>
+          <w:szCs w:val="20"/>
+        </w:rPr>
+        <w:t xml:space="preserve">Este análisis está representado en la figura V3 del material gráfico (panel a: el techo matemático; panel b: recuperación normalizada por categoría).</w:t>
       </w:r>
     </w:p>
     <w:p>
@@ -2280,7 +2297,7 @@
           <w:sz w:val="22"/>
           <w:szCs w:val="22"/>
         </w:rPr>
-        <w:t xml:space="preserve">3.3. Respaldo desde una revista de alto impacto</w:t>
+        <w:t xml:space="preserve">3.3. ¿Existe algún estudio que haya hecho lo mismo?</w:t>
       </w:r>
     </w:p>
     <w:p>
@@ -2297,7 +2314,58 @@
           <w:sz w:val="22"/>
           <w:szCs w:val="22"/>
         </w:rPr>
-        <w:t xml:space="preserve">La Ref. 10 (Stroke, 2025) es la referencia de mayor factor de impacto del conjunto y argumenta explícitamente por qué la rehabilitación de alta dosis e intensidad no se está entregando en la práctica clínica, pese a la evidencia que la respalda. Es el respaldo más fuerte para la conclusión del póster sobre dotación dedicada de terapia ocupacional en unidades de ACV agudo: su estudio documenta lo que esa revisión reclama. Advertencia de uso: trata la dosis de rehabilitación en general, no la terapia ocupacional de forma exclusiva; cítela para el argumento de dosis y dotación, no como evidencia específica de TO.</w:t>
+        <w:t xml:space="preserve">Búsqueda dirigida: no se encontró ningún estudio que replique el diseño completo de este trabajo, es decir, una cohorte de hospitalización aguda por ACV con terapia ocupacional centrada en reentrenamiento de AVD, con Barthel medido de ingreso a egreso dentro de una estadía de mediana 5 días, en población latinoamericana. Los trabajos más cercanos difieren en un punto crítico cada uno.</w:t>
+      </w:r>
+    </w:p>
+    <w:p>
+      <w:pPr>
+        <w:spacing w:after="120"/>
+      </w:pPr>
+      <w:r>
+        <w:rPr>
+          <w:b w:val="false"/>
+          <w:bCs w:val="false"/>
+          <w:i w:val="false"/>
+          <w:iCs w:val="false"/>
+          <w:color w:val="0B0B0B"/>
+          <w:sz w:val="22"/>
+          <w:szCs w:val="22"/>
+        </w:rPr>
+        <w:t xml:space="preserve">La Ref. 12 (Singapur, 2025; n=216) es la más parecida y la coincidencia es notable: usa exactamente el mismo desenlace primario —mejora de al menos un nivel de Barthel modificado entre ingreso y egreso— y una edad media casi idéntica (71,2 frente a 71,5 años). La diferencia está en el entorno: rehabilitación de internación en hospital comunitario, es decir, fase post-aguda, no hospitalización aguda.</w:t>
+      </w:r>
+    </w:p>
+    <w:p>
+      <w:pPr>
+        <w:spacing w:after="120"/>
+      </w:pPr>
+      <w:r>
+        <w:rPr>
+          <w:b w:val="false"/>
+          <w:bCs w:val="false"/>
+          <w:i w:val="false"/>
+          <w:iCs w:val="false"/>
+          <w:color w:val="0B0B0B"/>
+          <w:sz w:val="22"/>
+          <w:szCs w:val="22"/>
+        </w:rPr>
+        <w:t xml:space="preserve">La Ref. 13 (Tailandia, 2025; n=155) comparte el entorno exacto —unidad de ACV agudo, pacientes consecutivos con primer ACV— pero mide la trayectoria funcional desde el egreso hasta los seis meses, no el cambio que ocurre durante la hospitalización, que es justamente lo que este trabajo documenta.</w:t>
+      </w:r>
+    </w:p>
+    <w:p>
+      <w:pPr>
+        <w:spacing w:after="120"/>
+      </w:pPr>
+      <w:r>
+        <w:rPr>
+          <w:b w:val="false"/>
+          <w:bCs w:val="false"/>
+          <w:i w:val="false"/>
+          <w:iCs w:val="false"/>
+          <w:color w:val="0B0B0B"/>
+          <w:sz w:val="22"/>
+          <w:szCs w:val="22"/>
+        </w:rPr>
+        <w:t xml:space="preserve">Conclusión aprovechable para la defensa del póster: la ventana que este estudio mide —el cambio funcional que ocurre dentro de la hospitalización aguda misma, con Barthel pareado de ingreso y egreso— está poco documentada en la literatura reciente, y no se encontró en cohorte latinoamericana. Esa es la contribución específica del trabajo y conviene enunciarla de forma explícita, en lugar de presentarlo solo como una confirmación de hallazgos previos.</w:t>
       </w:r>
     </w:p>
     <w:p>
@@ -2314,7 +2382,7 @@
           <w:sz w:val="22"/>
           <w:szCs w:val="22"/>
         </w:rPr>
-        <w:t xml:space="preserve">3.4. Convergencia entre los dos ejes centrales</w:t>
+        <w:t xml:space="preserve">3.4. Respaldo desde una revista de alto impacto</w:t>
       </w:r>
     </w:p>
     <w:p>
@@ -2331,7 +2399,7 @@
           <w:sz w:val="22"/>
           <w:szCs w:val="22"/>
         </w:rPr>
-        <w:t xml:space="preserve">Las Ref. 2 y Ref. 7 coinciden, en cohortes de 39.140 y 3.000 pacientes, en que la función basal en AVD es el principal factor pronóstico del desenlace funcional. Su r = −0,446 va en la misma dirección y en una cohorte latinoamericana en fase aguda, contexto poco representado en esa literatura.</w:t>
+        <w:t xml:space="preserve">La Ref. 10 (Stroke, 2025) es la referencia de mayor factor de impacto del conjunto y argumenta explícitamente por qué la rehabilitación de alta dosis e intensidad no se está entregando en la práctica clínica, pese a la evidencia que la respalda. Es el respaldo más fuerte para la conclusión del póster sobre dotación dedicada de terapia ocupacional en unidades de ACV agudo: su estudio documenta lo que esa revisión reclama. Advertencia de uso: trata la dosis de rehabilitación en general, no la terapia ocupacional de forma exclusiva; cítela para el argumento de dosis y dotación, no como evidencia específica de TO.</w:t>
       </w:r>
     </w:p>
     <w:p>
@@ -2348,7 +2416,7 @@
           <w:sz w:val="22"/>
           <w:szCs w:val="22"/>
         </w:rPr>
-        <w:t xml:space="preserve">3.5. Precisiones de redacción aplicadas</w:t>
+        <w:t xml:space="preserve">3.5. Convergencia entre los dos ejes centrales</w:t>
       </w:r>
     </w:p>
     <w:p>
@@ -2365,24 +2433,24 @@
           <w:sz w:val="22"/>
           <w:szCs w:val="22"/>
         </w:rPr>
-        <w:t xml:space="preserve">• Deterioro: «ningún paciente descendió de categoría funcional (0/78); 98,7% sin deterioro de puntaje». Un paciente de 93 años descendió 5 puntos de Barthel sin cambiar de categoría.</w:t>
-      </w:r>
-    </w:p>
-    <w:p>
-      <w:pPr>
-        <w:spacing w:after="120"/>
-      </w:pPr>
-      <w:r>
-        <w:rPr>
-          <w:b w:val="false"/>
-          <w:bCs w:val="false"/>
+        <w:t xml:space="preserve">Las Ref. 2 y Ref. 7 coinciden, en cohortes de 39.140 y 3.000 pacientes, en que la función basal en AVD es el principal factor pronóstico del desenlace funcional. Su r = −0,446 va en la misma dirección y en una cohorte latinoamericana en fase aguda, contexto poco representado en esa literatura.</w:t>
+      </w:r>
+    </w:p>
+    <w:p>
+      <w:pPr>
+        <w:spacing w:after="100"/>
+      </w:pPr>
+      <w:r>
+        <w:rPr>
+          <w:b/>
+          <w:bCs/>
           <w:i w:val="false"/>
           <w:iCs w:val="false"/>
           <w:color w:val="0B0B0B"/>
           <w:sz w:val="22"/>
           <w:szCs w:val="22"/>
         </w:rPr>
-        <w:t xml:space="preserve">• Grupo etario: rotular 76–90 años, que es el corte que reproduce exactamente las cifras publicadas (+2,7 pts; 81,0%).</w:t>
+        <w:t xml:space="preserve">3.6. Precisiones de redacción aplicadas</w:t>
       </w:r>
     </w:p>
     <w:p>
@@ -2399,6 +2467,40 @@
           <w:sz w:val="22"/>
           <w:szCs w:val="22"/>
         </w:rPr>
+        <w:t xml:space="preserve">• Deterioro: «ningún paciente descendió de categoría funcional (0/78); 98,7% sin deterioro de puntaje». Un paciente de 93 años descendió 5 puntos de Barthel sin cambiar de categoría.</w:t>
+      </w:r>
+    </w:p>
+    <w:p>
+      <w:pPr>
+        <w:spacing w:after="120"/>
+      </w:pPr>
+      <w:r>
+        <w:rPr>
+          <w:b w:val="false"/>
+          <w:bCs w:val="false"/>
+          <w:i w:val="false"/>
+          <w:iCs w:val="false"/>
+          <w:color w:val="0B0B0B"/>
+          <w:sz w:val="22"/>
+          <w:szCs w:val="22"/>
+        </w:rPr>
+        <w:t xml:space="preserve">• Grupo etario: rotular 76–90 años, que es el corte que reproduce exactamente las cifras publicadas (+2,7 pts; 81,0%).</w:t>
+      </w:r>
+    </w:p>
+    <w:p>
+      <w:pPr>
+        <w:spacing w:after="120"/>
+      </w:pPr>
+      <w:r>
+        <w:rPr>
+          <w:b w:val="false"/>
+          <w:bCs w:val="false"/>
+          <w:i w:val="false"/>
+          <w:iCs w:val="false"/>
+          <w:color w:val="0B0B0B"/>
+          <w:sz w:val="22"/>
+          <w:szCs w:val="22"/>
+        </w:rPr>
         <w:t xml:space="preserve">• Severidad: definir explícitamente «Severe = BI 20–35» (21/25 = 84,0%). Sin esa definición la cifra no es reproducible: todo BI ≤35 rinde 63,2%.</w:t>
       </w:r>
     </w:p>
@@ -2416,7 +2518,7 @@
           <w:sz w:val="22"/>
           <w:szCs w:val="22"/>
         </w:rPr>
-        <w:t xml:space="preserve">3.6. Limitaciones a declarar antes de que las pregunten</w:t>
+        <w:t xml:space="preserve">3.7. Limitaciones a declarar antes de que las pregunten</w:t>
       </w:r>
     </w:p>
     <w:p>
@@ -2450,7 +2552,7 @@
           <w:sz w:val="22"/>
           <w:szCs w:val="22"/>
         </w:rPr>
-        <w:t xml:space="preserve">Diseño retrospectivo sin grupo control (no permite atribuir causalidad a la TO); atrición no aleatoria (26/104 sin Barthel pareado, de mayor edad —76,5 vs 69,8 años— y estadía más larga); &gt;90 años con n=4–5, estimaciones inestables; MMSE en versión de 19 puntos, no estándar; efecto techo en pacientes jóvenes; y regresión a la media como explicación alternativa parcial de la correlación entre puntaje de ingreso y cambio.</w:t>
+        <w:t xml:space="preserve">Diseño retrospectivo sin grupo control (no permite atribuir causalidad a la TO); atrición no aleatoria (26/104 sin Barthel pareado, de mayor edad —76,5 vs 69,8 años— y estadía más larga); &gt;90 años con n=4–5, estimaciones inestables; MMSE en versión de 19 puntos, no estándar; efecto techo en pacientes jóvenes; y regresión a la media como explicación alternativa parcial de la correlación entre puntaje de ingreso y cambio, objeción que la corrección por techo de la sección 3.2 responde en buena parte, aunque no la elimina del todo.</w:t>
       </w:r>
     </w:p>
     <w:p>

</xml_diff>